<commit_message>
chore: adiciona arquivos .gitignore e atualiza o README de setup do projeto
- Cria um .gitignore na raiz e outro em projeto-final-ia-suporte-sla para ignorar arquivos desnecessários.
- Atualiza o README.md com um guia passo a passo para configurar o ambiente e executar o pipeline, incluindo Airflow e Docker.
- Revisa as descrições dos modelos de machine learning e as métricas no README para maior clareza e precisão.
</commit_message>
<xml_diff>
--- a/projeto-final-ia-suporte-sla/docs/Relatorio_Projeto_Final.docx
+++ b/projeto-final-ia-suporte-sla/docs/Relatorio_Projeto_Final.docx
@@ -1208,7 +1208,7 @@
         <w:jc w:val="both"/>
       </w:pPr>
       <w:r>
-        <w:t>Usamos os algoritmos vistos na disciplina: KNN, SVM e MLP. Implementamos o KNN do zero (apenas NumPy): ele guarda os exemplos e, para prever, calcula a distância euclidiana até todos os pontos de treino, seleciona os k vizinhos mais próximos (usamos k = 15) e decide pela votação da maioria. Em seguida rodamos o mesmo KNN com o scikit-learn, e as duas versões ficaram idênticas (concordância de 100% nas predições), o que nos dá confiança de que a implementação manual está correta. Como comparação, treinamos ainda um SVM (kernel RBF) e um MLP (rede neural). O SVM teve o melhor desempenho (F1 = 0,77; ROC-AUC = 0,95) e foi escolhido como modelo de produção.</w:t>
+        <w:t>Usamos os algoritmos vistos na disciplina: KNN e MLP. Implementamos o KNN do zero (apenas NumPy): ele guarda os exemplos e, para prever, calcula a distância euclidiana até todos os pontos de treino, seleciona os k vizinhos mais próximos (usamos k = 15) e decide pela votação da maioria. Em seguida rodamos o mesmo KNN com o scikit-learn, e as duas versões ficaram idênticas (concordância de 100% nas predições), o que nos dá confiança de que a implementação manual está correta. Como comparação, treinamos ainda um MLP — uma rede neural com duas camadas ocultas de 64 e 32 neurônios. O MLP teve o melhor desempenho (F1 = 0,756; recall = 0,765; ROC-AUC = 0,944) e foi escolhido como modelo de produção.</w:t>
       </w:r>
     </w:p>
     <w:tbl>
@@ -1343,7 +1343,7 @@
               <w:rPr>
                 <w:sz w:val="19"/>
               </w:rPr>
-              <w:t>0.772</w:t>
+              <w:t>0,772</w:t>
             </w:r>
           </w:p>
         </w:tc>
@@ -1357,7 +1357,7 @@
               <w:rPr>
                 <w:sz w:val="19"/>
               </w:rPr>
-              <w:t>0.0</w:t>
+              <w:t>0,000</w:t>
             </w:r>
           </w:p>
         </w:tc>
@@ -1371,7 +1371,7 @@
               <w:rPr>
                 <w:sz w:val="19"/>
               </w:rPr>
-              <w:t>0.0</w:t>
+              <w:t>0,000</w:t>
             </w:r>
           </w:p>
         </w:tc>
@@ -1385,7 +1385,7 @@
               <w:rPr>
                 <w:sz w:val="19"/>
               </w:rPr>
-              <w:t>0.0</w:t>
+              <w:t>0,000</w:t>
             </w:r>
           </w:p>
         </w:tc>
@@ -1399,7 +1399,7 @@
               <w:rPr>
                 <w:sz w:val="19"/>
               </w:rPr>
-              <w:t>0.5</w:t>
+              <w:t>0,500</w:t>
             </w:r>
           </w:p>
         </w:tc>
@@ -1429,7 +1429,7 @@
               <w:rPr>
                 <w:sz w:val="19"/>
               </w:rPr>
-              <w:t>0.771</w:t>
+              <w:t>0,771</w:t>
             </w:r>
           </w:p>
         </w:tc>
@@ -1443,7 +1443,7 @@
               <w:rPr>
                 <w:sz w:val="19"/>
               </w:rPr>
-              <w:t>0.4983</w:t>
+              <w:t>0,498</w:t>
             </w:r>
           </w:p>
         </w:tc>
@@ -1457,7 +1457,7 @@
               <w:rPr>
                 <w:sz w:val="19"/>
               </w:rPr>
-              <w:t>0.6294</w:t>
+              <w:t>0,629</w:t>
             </w:r>
           </w:p>
         </w:tc>
@@ -1471,7 +1471,7 @@
               <w:rPr>
                 <w:sz w:val="19"/>
               </w:rPr>
-              <w:t>0.5562</w:t>
+              <w:t>0,556</w:t>
             </w:r>
           </w:p>
         </w:tc>
@@ -1485,7 +1485,7 @@
               <w:rPr>
                 <w:sz w:val="19"/>
               </w:rPr>
-              <w:t>0.7211</w:t>
+              <w:t>0,721</w:t>
             </w:r>
           </w:p>
         </w:tc>
@@ -1515,7 +1515,7 @@
               <w:rPr>
                 <w:sz w:val="19"/>
               </w:rPr>
-              <w:t>0.838</w:t>
+              <w:t>0,838</w:t>
             </w:r>
           </w:p>
         </w:tc>
@@ -1529,7 +1529,7 @@
               <w:rPr>
                 <w:sz w:val="19"/>
               </w:rPr>
-              <w:t>0.7619</w:t>
+              <w:t>0,762</w:t>
             </w:r>
           </w:p>
         </w:tc>
@@ -1543,7 +1543,7 @@
               <w:rPr>
                 <w:sz w:val="19"/>
               </w:rPr>
-              <w:t>0.4211</w:t>
+              <w:t>0,421</w:t>
             </w:r>
           </w:p>
         </w:tc>
@@ -1557,7 +1557,7 @@
               <w:rPr>
                 <w:sz w:val="19"/>
               </w:rPr>
-              <w:t>0.5424</w:t>
+              <w:t>0,542</w:t>
             </w:r>
           </w:p>
         </w:tc>
@@ -1571,7 +1571,7 @@
               <w:rPr>
                 <w:sz w:val="19"/>
               </w:rPr>
-              <w:t>0.8821</w:t>
+              <w:t>0,882</w:t>
             </w:r>
           </w:p>
         </w:tc>
@@ -1601,7 +1601,7 @@
               <w:rPr>
                 <w:sz w:val="19"/>
               </w:rPr>
-              <w:t>0.838</w:t>
+              <w:t>0,838</w:t>
             </w:r>
           </w:p>
         </w:tc>
@@ -1615,7 +1615,7 @@
               <w:rPr>
                 <w:sz w:val="19"/>
               </w:rPr>
-              <w:t>0.7619</w:t>
+              <w:t>0,762</w:t>
             </w:r>
           </w:p>
         </w:tc>
@@ -1629,7 +1629,7 @@
               <w:rPr>
                 <w:sz w:val="19"/>
               </w:rPr>
-              <w:t>0.4211</w:t>
+              <w:t>0,421</w:t>
             </w:r>
           </w:p>
         </w:tc>
@@ -1643,7 +1643,7 @@
               <w:rPr>
                 <w:sz w:val="19"/>
               </w:rPr>
-              <w:t>0.5424</w:t>
+              <w:t>0,542</w:t>
             </w:r>
           </w:p>
         </w:tc>
@@ -1657,7 +1657,7 @@
               <w:rPr>
                 <w:sz w:val="19"/>
               </w:rPr>
-              <w:t>0.8821</w:t>
+              <w:t>0,882</w:t>
             </w:r>
           </w:p>
         </w:tc>
@@ -1673,7 +1673,7 @@
               <w:rPr>
                 <w:sz w:val="19"/>
               </w:rPr>
-              <w:t>SVM (produção)</w:t>
+              <w:t>MLP (produção)</w:t>
             </w:r>
           </w:p>
         </w:tc>
@@ -1687,7 +1687,7 @@
               <w:rPr>
                 <w:sz w:val="19"/>
               </w:rPr>
-              <w:t>0.903</w:t>
+              <w:t>0,887</w:t>
             </w:r>
           </w:p>
         </w:tc>
@@ -1701,7 +1701,7 @@
               <w:rPr>
                 <w:sz w:val="19"/>
               </w:rPr>
-              <w:t>0.8541</w:t>
+              <w:t>0,747</w:t>
             </w:r>
           </w:p>
         </w:tc>
@@ -1715,7 +1715,7 @@
               <w:rPr>
                 <w:sz w:val="19"/>
               </w:rPr>
-              <w:t>0.693</w:t>
+              <w:t>0,765</w:t>
             </w:r>
           </w:p>
         </w:tc>
@@ -1729,7 +1729,7 @@
               <w:rPr>
                 <w:sz w:val="19"/>
               </w:rPr>
-              <w:t>0.7651</w:t>
+              <w:t>0,756</w:t>
             </w:r>
           </w:p>
         </w:tc>
@@ -1743,93 +1743,7 @@
               <w:rPr>
                 <w:sz w:val="19"/>
               </w:rPr>
-              <w:t>0.9529</w:t>
-            </w:r>
-          </w:p>
-        </w:tc>
-      </w:tr>
-      <w:tr>
-        <w:tc>
-          <w:tcPr>
-            <w:tcW w:type="dxa" w:w="1440"/>
-          </w:tcPr>
-          <w:p>
-            <w:r/>
-            <w:r>
-              <w:rPr>
-                <w:sz w:val="19"/>
-              </w:rPr>
-              <w:t>MLP</w:t>
-            </w:r>
-          </w:p>
-        </w:tc>
-        <w:tc>
-          <w:tcPr>
-            <w:tcW w:type="dxa" w:w="1440"/>
-          </w:tcPr>
-          <w:p>
-            <w:r/>
-            <w:r>
-              <w:rPr>
-                <w:sz w:val="19"/>
-              </w:rPr>
-              <w:t>0.8875</w:t>
-            </w:r>
-          </w:p>
-        </w:tc>
-        <w:tc>
-          <w:tcPr>
-            <w:tcW w:type="dxa" w:w="1440"/>
-          </w:tcPr>
-          <w:p>
-            <w:r/>
-            <w:r>
-              <w:rPr>
-                <w:sz w:val="19"/>
-              </w:rPr>
-              <w:t>0.7473</w:t>
-            </w:r>
-          </w:p>
-        </w:tc>
-        <w:tc>
-          <w:tcPr>
-            <w:tcW w:type="dxa" w:w="1440"/>
-          </w:tcPr>
-          <w:p>
-            <w:r/>
-            <w:r>
-              <w:rPr>
-                <w:sz w:val="19"/>
-              </w:rPr>
-              <w:t>0.7654</w:t>
-            </w:r>
-          </w:p>
-        </w:tc>
-        <w:tc>
-          <w:tcPr>
-            <w:tcW w:type="dxa" w:w="1440"/>
-          </w:tcPr>
-          <w:p>
-            <w:r/>
-            <w:r>
-              <w:rPr>
-                <w:sz w:val="19"/>
-              </w:rPr>
-              <w:t>0.7562</w:t>
-            </w:r>
-          </w:p>
-        </w:tc>
-        <w:tc>
-          <w:tcPr>
-            <w:tcW w:type="dxa" w:w="1440"/>
-          </w:tcPr>
-          <w:p>
-            <w:r/>
-            <w:r>
-              <w:rPr>
-                <w:sz w:val="19"/>
-              </w:rPr>
-              <w:t>0.9443</w:t>
+              <w:t>0,944</w:t>
             </w:r>
           </w:p>
         </w:tc>

</xml_diff>